<commit_message>
Add crud and doc
</commit_message>
<xml_diff>
--- a/Doc/PracticasDoc.docx
+++ b/Doc/PracticasDoc.docx
@@ -4,6 +4,9 @@
   <w:body>
     <w:p>
       <w:r>
+        <w:rPr>
+          <w:noProof/>
+        </w:rPr>
         <w:drawing>
           <wp:inline distT="0" distB="0" distL="0" distR="0" wp14:anchorId="1BFB96C4" wp14:editId="13BCB61E">
             <wp:extent cx="5612130" cy="3380740"/>
@@ -43,6 +46,9 @@
     </w:p>
     <w:p>
       <w:r>
+        <w:rPr>
+          <w:noProof/>
+        </w:rPr>
         <w:drawing>
           <wp:inline distT="0" distB="0" distL="0" distR="0" wp14:anchorId="63356282" wp14:editId="3B5B1D33">
             <wp:extent cx="5612130" cy="3098800"/>
@@ -78,6 +84,69 @@
             </a:graphic>
           </wp:inline>
         </w:drawing>
+      </w:r>
+    </w:p>
+    <w:p>
+      <w:r>
+        <w:rPr>
+          <w:noProof/>
+        </w:rPr>
+        <w:lastRenderedPageBreak/>
+        <w:drawing>
+          <wp:inline distT="0" distB="0" distL="0" distR="0" wp14:anchorId="5E573573" wp14:editId="51CF7B9E">
+            <wp:extent cx="5612130" cy="2275840"/>
+            <wp:effectExtent l="0" t="0" r="7620" b="0"/>
+            <wp:docPr id="3" name="Imagen 3"/>
+            <wp:cNvGraphicFramePr>
+              <a:graphicFrameLocks xmlns:a="http://schemas.openxmlformats.org/drawingml/2006/main" noChangeAspect="1"/>
+            </wp:cNvGraphicFramePr>
+            <a:graphic xmlns:a="http://schemas.openxmlformats.org/drawingml/2006/main">
+              <a:graphicData uri="http://schemas.openxmlformats.org/drawingml/2006/picture">
+                <pic:pic xmlns:pic="http://schemas.openxmlformats.org/drawingml/2006/picture">
+                  <pic:nvPicPr>
+                    <pic:cNvPr id="1" name=""/>
+                    <pic:cNvPicPr/>
+                  </pic:nvPicPr>
+                  <pic:blipFill>
+                    <a:blip r:embed="rId6"/>
+                    <a:stretch>
+                      <a:fillRect/>
+                    </a:stretch>
+                  </pic:blipFill>
+                  <pic:spPr>
+                    <a:xfrm>
+                      <a:off x="0" y="0"/>
+                      <a:ext cx="5612130" cy="2275840"/>
+                    </a:xfrm>
+                    <a:prstGeom prst="rect">
+                      <a:avLst/>
+                    </a:prstGeom>
+                  </pic:spPr>
+                </pic:pic>
+              </a:graphicData>
+            </a:graphic>
+          </wp:inline>
+        </w:drawing>
+      </w:r>
+    </w:p>
+    <w:p>
+      <w:r>
+        <w:t xml:space="preserve">Add-Migration InitialCreate </w:t>
+      </w:r>
+    </w:p>
+    <w:p>
+      <w:r>
+        <w:t>Update-Database</w:t>
+      </w:r>
+    </w:p>
+    <w:p>
+      <w:pPr>
+        <w:rPr>
+          <w:u w:val="single"/>
+        </w:rPr>
+      </w:pPr>
+      <w:r>
+        <w:t>data anotation</w:t>
       </w:r>
     </w:p>
     <w:sectPr>
@@ -693,7 +762,6 @@
   <w:style w:type="character" w:default="1" w:styleId="Fuentedeprrafopredeter">
     <w:name w:val="Default Paragraph Font"/>
     <w:uiPriority w:val="1"/>
-    <w:semiHidden/>
     <w:unhideWhenUsed/>
   </w:style>
   <w:style w:type="table" w:default="1" w:styleId="Tablanormal">

</xml_diff>